<commit_message>
Improve RouteMind_Project_Book.docx: strengthen weak areas for formal submission
- Strengthen executive summary with academic tone and two-language mention
- Expand motivation section with practical value and topic selection rationale
- Add section 6.4: Two-language integration (Python ↔ JavaScript)
- Add section 6.5: UML/System Analysis descriptions (use cases, class diagram, architecture, flows)
- Professionalize section 13.4: Limitations as engineering decisions
- Add section 15: Bibliography with real, relevant sources
- Strengthen introduction with academic framing
- Add two-language innovation in section 13.3
- Update table of contents

Agent-Logs-Url: https://github.com/ilushon-collab/RouteMind-Project/sessions/a1358b8d-1455-4fe3-8a32-475c11176ab3

Co-authored-by: ilushon-collab <274593261+ilushon-collab@users.noreply.github.com>
</commit_message>
<xml_diff>
--- a/RouteMind_Project_Book.docx
+++ b/RouteMind_Project_Book.docx
@@ -268,7 +268,133 @@
       </w:r>
     </w:p>
     <w:p>
-      <w:pPr>
+      <w:pPr/>
+      <w:r>
+        <w:t>15. מקורות וביבליוגרפיה</w:t>
+      </w:r>
+    </w:p>
+    <w:p>
+      <w:pPr>
+        <w:bidi w:val="1"/>
+      </w:pPr>
+      <w:r>
+        <w:t>16. נספחים</w:t>
+      </w:r>
+    </w:p>
+    <w:p>
+      <w:r>
+        <w:br w:type="page"/>
+      </w:r>
+    </w:p>
+    <w:p>
+      <w:r>
+        <w:br w:type="page"/>
+      </w:r>
+    </w:p>
+    <w:p>
+      <w:pPr>
+        <w:pStyle w:val="Heading1"/>
+        <w:bidi w:val="1"/>
+      </w:pPr>
+      <w:r>
+        <w:rPr>
+          <w:rtl/>
+        </w:rPr>
+        <w:t>1. תקציר מנהלים</w:t>
+      </w:r>
+    </w:p>
+    <w:p>
+      <w:pPr>
+        <w:bidi w:val="1"/>
+      </w:pPr>
+      <w:r>
+        <w:t>מסמך זה מציג את פרויקט הגמר RouteMind – מערכת אופטימיזציה למסלולי שילוח המבוססת על אלגוריתמים הוריסטיים לפתרון בעיית ניתוב רכבים עם חלונות זמן (Vehicle Routing Problem with Time Windows – VRPTW). הפרויקט פותח כפרויקט גמר בהנדסת תוכנה, ומהווה מערכת תוכנה שלמה הכוללת צד שרת, צד לקוח, ומנוע אלגוריתמי – תוך שילוב פונקציונלי בין שתי שפות תכנות: Python לצד השרת ו-JavaScript לצד הלקוח.</w:t>
+      </w:r>
+    </w:p>
+    <w:p>
+      <w:pPr>
+        <w:bidi w:val="1"/>
+      </w:pPr>
+      <w:r>
+        <w:t>המערכת מאפשרת למשתמשים להגדיר נקודות עצירה עם מגבלות זמן ועדיפויות, ולקבל מסלול אופטימלי תוך שקלול מרחק, זמני המתנה, איחורים ועומסי משמרת. הארכיטקטורה מבוססת על שרת FastAPI (Python) המספק REST API מלא, עם מנוע אופטימיזציה הכולל בנייה חמדנית (Greedy) של מסלול התחלתי ושיפורו באמצעות אלגוריתמי חיפוש מקומי (2-opt, Swap, Relocate). צד הלקוח בנוי כאפליקציית דף יחיד (SPA) ב-JavaScript טהור, עם תקשורת מבוססת JSON/REST מול השרת, ממשק מפות אינטראקטיבי (Leaflet.js), מערכת אימות מבוססת JWT, ותמיכה בניהול תרחישים והיסטוריית אופטימיזציות.</w:t>
+      </w:r>
+    </w:p>
+    <w:p>
+      <w:pPr>
+        <w:bidi w:val="1"/>
+      </w:pPr>
+      <w:r>
+        <w:t>הטכנולוגיות העיקריות: Python 3.11+ (FastAPI, Pydantic v2, Uvicorn) בצד השרת; HTML/CSS/JavaScript (Vanilla) עם Leaflet.js בצד הלקוח; SQLite לאחסון נתונים; ו-Docker לפריסה. הפרויקט מדגים שילוב מלא בין פיתוח אלגוריתמי, תכנון ארכיטקטורת תוכנה, אבטחת מידע, וממשק משתמש – כנדרש בפרויקט גמר בהנדסת תוכנה.</w:t>
+      </w:r>
+    </w:p>
+    <w:p>
+      <w:r>
+        <w:br w:type="page"/>
+      </w:r>
+    </w:p>
+    <w:p>
+      <w:pPr>
+        <w:pStyle w:val="Heading1"/>
+        <w:bidi w:val="1"/>
+      </w:pPr>
+      <w:r>
+        <w:rPr>
+          <w:rtl/>
+        </w:rPr>
+        <w:t>2. מבוא</w:t>
+      </w:r>
+    </w:p>
+    <w:p>
+      <w:pPr>
+        <w:pStyle w:val="Heading2"/>
+        <w:bidi w:val="1"/>
+      </w:pPr>
+      <w:r>
+        <w:rPr>
+          <w:rtl/>
+        </w:rPr>
+        <w:t>2.1 הצגת הנושא</w:t>
+      </w:r>
+    </w:p>
+    <w:p>
+      <w:pPr>
+        <w:bidi w:val="1"/>
+      </w:pPr>
+      <w:r>
+        <w:t>בעיית ניתוב רכבים (Vehicle Routing Problem – VRP) היא אחת הבעיות המרכזיות והנחקרות ביותר בתחום מחקר הביצועים (Operations Research) ובלוגיסטיקה חישובית. הבעיה, שהוגדרה לראשונה על-ידי Dantzig &amp; Ramser ב-1959, עוסקת במציאת סדר ביקורים אופטימלי בקבוצת נקודות (לקוחות, עצירות) כך שעלות הנסיעה הכוללת תהיה מינימלית, בכפוף למגבלות שונות. הבעיה שייכת למחלקת NP-hard, כלומר אין אלגוריתם פולינומי ידוע לפתרון מדויק שלה – ולכן נעשה שימוש נרחב בהוריסטיקות ובמטה-הוריסטיקות.</w:t>
+      </w:r>
+    </w:p>
+    <w:p>
+      <w:pPr>
+        <w:bidi w:val="1"/>
+      </w:pPr>
+      <w:r>
+        <w:t>הווריאנט VRPTW (Vehicle Routing Problem with Time Windows) מוסיף מגבלות חלונות זמן – לכל נקודת עצירה מוגדר טווח זמנים מותר שבו ניתן להתחיל את השירות. תוספת זו הופכת את הבעיה למורכבת יותר באופן משמעותי, שכן נדרש איזון בין קיצור מרחקי נסיעה לבין עמידה במגבלות הזמן, תוך התחשבות בעדיפויות שונות ובמגבלות משמרת. VRPTW מהווה מודל מתמטי רלוונטי במיוחד לעולם הלוגיסטיקה המודרני, שבו לקוחות דורשים שירות בזמנים מוגדרים ונהגים מוגבלים במשמרות עבודה.</w:t>
+      </w:r>
+    </w:p>
+    <w:p>
+      <w:pPr>
+        <w:pStyle w:val="Heading2"/>
+        <w:bidi w:val="1"/>
+      </w:pPr>
+      <w:r>
+        <w:rPr>
+          <w:rtl/>
+        </w:rPr>
+        <w:t>2.2 מוטיבציה</w:t>
+      </w:r>
+    </w:p>
+    <w:p>
+      <w:pPr>
+        <w:bidi w:val="1"/>
+      </w:pPr>
+      <w:r>
+        <w:t>בעיית ניתוב רכבים עם חלונות זמן (VRPTW) היא אחד האתגרים המרכזיים בתחום הלוגיסטיקה המודרנית. חברות שילוח, שירותי משלוחים, וארגוני שירות שדה מתמודדים מדי יום עם הצורך לתכנן מסלולים יעילים לעשרות ולמאות נקודות עצירה – כאשר כל עצירה כפופה למגבלות זמן, עדיפויות שונות, ומשמרות עבודה מוגבלות. תכנון ידני או תכנון לא אופטימלי מוביל לתוצאות שליליות משמעותיות:</w:t>
+      </w:r>
+    </w:p>
+    <w:p>
+      <w:pPr>
+        <w:pStyle w:val="ListBullet"/>
         <w:bidi w:val="1"/>
       </w:pPr>
       <w:r>
@@ -276,53 +402,38 @@
           <w:sz w:val="22"/>
           <w:rtl/>
         </w:rPr>
-        <w:t>14. נספחים</w:t>
-      </w:r>
-    </w:p>
-    <w:p>
-      <w:r>
-        <w:br w:type="page"/>
-      </w:r>
-    </w:p>
-    <w:p>
-      <w:r>
-        <w:br w:type="page"/>
-      </w:r>
-    </w:p>
-    <w:p>
-      <w:pPr>
-        <w:pStyle w:val="Heading1"/>
-        <w:bidi w:val="1"/>
-      </w:pPr>
-      <w:r>
-        <w:rPr>
-          <w:rtl/>
-        </w:rPr>
-        <w:t>1. תקציר מנהלים</w:t>
-      </w:r>
-    </w:p>
-    <w:p>
-      <w:pPr>
-        <w:bidi w:val="1"/>
-      </w:pPr>
-      <w:r>
-        <w:rPr>
-          <w:b/>
+        <w:t>עלויות דלק מיותרות</w:t>
+      </w:r>
+    </w:p>
+    <w:p>
+      <w:pPr>
+        <w:pStyle w:val="ListBullet"/>
+        <w:bidi w:val="1"/>
+      </w:pPr>
+      <w:r>
+        <w:rPr>
           <w:sz w:val="22"/>
           <w:rtl/>
         </w:rPr>
-        <w:t>RouteMind</w:t>
-      </w:r>
+        <w:t>איחורים ללקוחות</w:t>
+      </w:r>
+    </w:p>
+    <w:p>
+      <w:pPr>
+        <w:pStyle w:val="ListBullet"/>
+        <w:bidi w:val="1"/>
+      </w:pPr>
       <w:r>
         <w:rPr>
           <w:sz w:val="22"/>
           <w:rtl/>
         </w:rPr>
-        <w:t xml:space="preserve"> היא מערכת אופטימיזציה למסלולי שילוח המבוססת על אלגוריתמים הוריסטיים לפתרון בעיית ניתוב רכבים עם חלונות זמן (Vehicle Routing Problem with Time Windows – VRPTW). המערכת מאפשרת למשתמשים להגדיר נקודות עצירה עם מגבלות זמן ועדיפויות, ולקבל מסלול אופטימלי תוך שקלול מרחק, זמני המתנה, איחורים ועומסי משמרת.</w:t>
-      </w:r>
-    </w:p>
-    <w:p>
-      <w:pPr>
+        <w:t>חריגות ממשמרות עבודה</w:t>
+      </w:r>
+    </w:p>
+    <w:p>
+      <w:pPr>
+        <w:pStyle w:val="ListBullet"/>
         <w:bidi w:val="1"/>
       </w:pPr>
       <w:r>
@@ -330,11 +441,20 @@
           <w:sz w:val="22"/>
           <w:rtl/>
         </w:rPr>
-        <w:t>המערכת מורכבת משרת API מבוסס FastAPI עם מנוע אופטימיזציה הכולל בנייה חמדנית (Greedy) של מסלול התחלתי ושיפורו באמצעות אלגוריתמי חיפוש מקומי (2-opt, Swap, Relocate). כמו כן, המערכת כוללת ממשק דפדפן אינטראקטיבי עם תמיכה במפות, ג'אוקודינג, ניהול תרחישים, והיסטוריית אופטימיזציות.</w:t>
-      </w:r>
-    </w:p>
-    <w:p>
-      <w:pPr>
+        <w:t>ירידה בשביעות רצון הלקוחות</w:t>
+      </w:r>
+    </w:p>
+    <w:p>
+      <w:pPr>
+        <w:bidi w:val="1"/>
+      </w:pPr>
+      <w:r>
+        <w:t>הפרויקט RouteMind נולד מתוך ההבנה שקיים צורך אמיתי בכלי אופטימיזציה נגיש, מהיר, וגמיש – כזה שמאפשר למשתמש להגדיר את הבעיה הספציפית שלו, להריץ אלגוריתמי אופטימיזציה, ולקבל תוצאות ויזואליות מיידיות. הערך המעשי של המערכת מתבטא בחיסכון בעלויות תפעול, שיפור שביעות רצון הלקוחות, צמצום זמני נסיעה מיותרים, ועמידה במגבלות משמרת. מעבר לערך הפרקטי, הפרויקט מדגים יישום מעשי של עקרונות מדעי המחשב – אלגוריתמיקה, הנדסת תוכנה, ואבטחת מידע – במערכת אחת שלמה. המערכת תוכננה עם דגש על:</w:t>
+      </w:r>
+    </w:p>
+    <w:p>
+      <w:pPr>
+        <w:pStyle w:val="ListBullet"/>
         <w:bidi w:val="1"/>
       </w:pPr>
       <w:r>
@@ -342,40 +462,12 @@
           <w:sz w:val="22"/>
           <w:rtl/>
         </w:rPr>
-        <w:t>הטכנולוגיות העיקריות: Python 3.11+, FastAPI, Pydantic v2, SQLite, Uvicorn, HTML/CSS/JavaScript (Vanilla), Leaflet.js למפות, ו-Docker לפריסה.</w:t>
-      </w:r>
-    </w:p>
-    <w:p>
-      <w:r>
-        <w:br w:type="page"/>
-      </w:r>
-    </w:p>
-    <w:p>
-      <w:pPr>
-        <w:pStyle w:val="Heading1"/>
-        <w:bidi w:val="1"/>
-      </w:pPr>
-      <w:r>
-        <w:rPr>
-          <w:rtl/>
-        </w:rPr>
-        <w:t>2. מבוא</w:t>
-      </w:r>
-    </w:p>
-    <w:p>
-      <w:pPr>
-        <w:pStyle w:val="Heading2"/>
-        <w:bidi w:val="1"/>
-      </w:pPr>
-      <w:r>
-        <w:rPr>
-          <w:rtl/>
-        </w:rPr>
-        <w:t>2.1 הצגת הנושא</w:t>
-      </w:r>
-    </w:p>
-    <w:p>
-      <w:pPr>
+        <w:t>תמיכה בחלונות זמן לכל עצירה</w:t>
+      </w:r>
+    </w:p>
+    <w:p>
+      <w:pPr>
+        <w:pStyle w:val="ListBullet"/>
         <w:bidi w:val="1"/>
       </w:pPr>
       <w:r>
@@ -383,11 +475,12 @@
           <w:sz w:val="22"/>
           <w:rtl/>
         </w:rPr>
-        <w:t>בעיית ניתוב רכבים (VRP) היא אחת הבעיות המרכזיות במחקר ביצועים ובלוגיסטיקה. במקרה הכללי, מטרת הבעיה היא למצוא את סדר הביקורים האופטימלי בקבוצת נקודות (לקוחות, עצירות) כך שעלות הנסיעה הכוללת תהיה מינימלית, בכפוף למגבלות שונות.</w:t>
-      </w:r>
-    </w:p>
-    <w:p>
-      <w:pPr>
+        <w:t>מערכת עדיפויות (1–5) להבחנה בין עצירות קריטיות לפחות דחופות</w:t>
+      </w:r>
+    </w:p>
+    <w:p>
+      <w:pPr>
+        <w:pStyle w:val="ListBullet"/>
         <w:bidi w:val="1"/>
       </w:pPr>
       <w:r>
@@ -395,23 +488,12 @@
           <w:sz w:val="22"/>
           <w:rtl/>
         </w:rPr>
-        <w:t>הווריאנט VRPTW (Vehicle Routing Problem with Time Windows) מוסיף מגבלות חלונות זמן – לכל נקודת עצירה יש זמן מוקדם ביותר וזמן מאוחר ביותר שבהם ניתן להגיע אליה. תוספת זו הופכת את הבעיה למורכבת יותר באופן משמעותי, ודורשת איזון בין קיצור מרחקים לבין עמידה במגבלות הזמן.</w:t>
-      </w:r>
-    </w:p>
-    <w:p>
-      <w:pPr>
-        <w:pStyle w:val="Heading2"/>
-        <w:bidi w:val="1"/>
-      </w:pPr>
-      <w:r>
-        <w:rPr>
-          <w:rtl/>
-        </w:rPr>
-        <w:t>2.2 מוטיבציה</w:t>
-      </w:r>
-    </w:p>
-    <w:p>
-      <w:pPr>
+        <w:t>אכיפת מגבלת משמרת (shift time) למניעת חריגה</w:t>
+      </w:r>
+    </w:p>
+    <w:p>
+      <w:pPr>
+        <w:pStyle w:val="ListBullet"/>
         <w:bidi w:val="1"/>
       </w:pPr>
       <w:r>
@@ -419,7 +501,7 @@
           <w:sz w:val="22"/>
           <w:rtl/>
         </w:rPr>
-        <w:t>חברות שילוח, שירותי משלוחים, וארגוני שירות שדה מתמודדים יומיומית עם אתגר תכנון מסלולים יעיל. תכנון לא אופטימלי מוביל ל:</w:t>
+        <w:t>משקלות ניתנים לכיוונון לכל רכיב עלות</w:t>
       </w:r>
     </w:p>
     <w:p>
@@ -432,131 +514,27 @@
           <w:sz w:val="22"/>
           <w:rtl/>
         </w:rPr>
-        <w:t>עלויות דלק מיותרות</w:t>
-      </w:r>
-    </w:p>
-    <w:p>
-      <w:pPr>
-        <w:pStyle w:val="ListBullet"/>
-        <w:bidi w:val="1"/>
-      </w:pPr>
-      <w:r>
-        <w:rPr>
-          <w:sz w:val="22"/>
-          <w:rtl/>
-        </w:rPr>
-        <w:t>איחורים ללקוחות</w:t>
-      </w:r>
-    </w:p>
-    <w:p>
-      <w:pPr>
-        <w:pStyle w:val="ListBullet"/>
-        <w:bidi w:val="1"/>
-      </w:pPr>
-      <w:r>
-        <w:rPr>
-          <w:sz w:val="22"/>
-          <w:rtl/>
-        </w:rPr>
-        <w:t>חריגות ממשמרות עבודה</w:t>
-      </w:r>
-    </w:p>
-    <w:p>
-      <w:pPr>
-        <w:pStyle w:val="ListBullet"/>
-        <w:bidi w:val="1"/>
-      </w:pPr>
-      <w:r>
-        <w:rPr>
-          <w:sz w:val="22"/>
-          <w:rtl/>
-        </w:rPr>
-        <w:t>ירידה בשביעות רצון הלקוחות</w:t>
-      </w:r>
-    </w:p>
-    <w:p>
-      <w:pPr>
-        <w:bidi w:val="1"/>
-      </w:pPr>
-      <w:r>
-        <w:rPr>
-          <w:b/>
-          <w:sz w:val="22"/>
-          <w:rtl/>
-        </w:rPr>
-        <w:t>RouteMind</w:t>
-      </w:r>
-      <w:r>
-        <w:rPr>
-          <w:sz w:val="22"/>
-          <w:rtl/>
-        </w:rPr>
-        <w:t xml:space="preserve"> נועדה לספק כלי נגיש, מהיר וגמיש לאופטימיזציה של מסלולים, עם דגש על:</w:t>
-      </w:r>
-    </w:p>
-    <w:p>
-      <w:pPr>
-        <w:pStyle w:val="ListBullet"/>
-        <w:bidi w:val="1"/>
-      </w:pPr>
-      <w:r>
-        <w:rPr>
-          <w:sz w:val="22"/>
-          <w:rtl/>
-        </w:rPr>
-        <w:t>תמיכה בחלונות זמן לכל עצירה</w:t>
-      </w:r>
-    </w:p>
-    <w:p>
-      <w:pPr>
-        <w:pStyle w:val="ListBullet"/>
-        <w:bidi w:val="1"/>
-      </w:pPr>
-      <w:r>
-        <w:rPr>
-          <w:sz w:val="22"/>
-          <w:rtl/>
-        </w:rPr>
-        <w:t>מערכת עדיפויות (1–5) להבחנה בין עצירות קריטיות לפחות דחופות</w:t>
-      </w:r>
-    </w:p>
-    <w:p>
-      <w:pPr>
-        <w:pStyle w:val="ListBullet"/>
-        <w:bidi w:val="1"/>
-      </w:pPr>
-      <w:r>
-        <w:rPr>
-          <w:sz w:val="22"/>
-          <w:rtl/>
-        </w:rPr>
-        <w:t>אכיפת מגבלת משמרת (shift time) למניעת חריגה</w:t>
-      </w:r>
-    </w:p>
-    <w:p>
-      <w:pPr>
-        <w:pStyle w:val="ListBullet"/>
-        <w:bidi w:val="1"/>
-      </w:pPr>
-      <w:r>
-        <w:rPr>
-          <w:sz w:val="22"/>
-          <w:rtl/>
-        </w:rPr>
-        <w:t>משקלות ניתנים לכיוונון לכל רכיב עלות</w:t>
-      </w:r>
-    </w:p>
-    <w:p>
-      <w:pPr>
-        <w:pStyle w:val="ListBullet"/>
-        <w:bidi w:val="1"/>
-      </w:pPr>
-      <w:r>
-        <w:rPr>
-          <w:sz w:val="22"/>
-          <w:rtl/>
-        </w:rPr>
         <w:t>ממשק ויזואלי אינטואיטיבי עם מפות</w:t>
+      </w:r>
+    </w:p>
+    <w:p>
+      <w:pPr>
+        <w:pStyle w:val="Heading3"/>
+      </w:pPr>
+      <w:r>
+        <w:t>2.2.1 בחירת הנושא והערך החינוכי-טכנולוגי</w:t>
+      </w:r>
+    </w:p>
+    <w:p>
+      <w:pPr/>
+      <w:r>
+        <w:t>נושא הפרויקט נבחר משילוב של שיקולים מקצועיים וחינוכיים. מבחינה מקצועית, בעיית VRPTW היא בעיית אופטימיזציה קלאסית בעלת רלוונטיות תעשייתית גבוהה – כל חברת לוגיסטיקה, שליחויות, או שירות שדה נדרשת לפתור אותה. מבחינה חינוכית, הפרויקט מאפשר הדגמה מעמיקה של מספר תחומי ליבה בהנדסת תוכנה: תכנון אלגוריתמים (הוריסטיקות, חיפוש מקומי), ארכיטקטורת תוכנה (שכבות, REST API, SPA), אבטחת מידע (JWT, הצפנת סיסמאות, Rate Limiting), ופיתוח Full-Stack בשתי שפות (Python ו-JavaScript).</w:t>
+      </w:r>
+    </w:p>
+    <w:p>
+      <w:pPr/>
+      <w:r>
+        <w:t>הערך הטכנולוגי של הפרויקט מתבטא בכך שהוא מהווה מערכת עצמאית שאינה תלויה בשירותי צד שלישי לפעולות הליבה שלה – מנוע האופטימיזציה, מערכת האימות, ומנגנון חישוב המרחקים פועלים באופן עצמאי לחלוטין. עובדה זו מאפשרת פריסה פשוטה ומהירה, הפעלה בסביבות מבודדות, ובקרה מלאה על לוגיקת המערכת.</w:t>
       </w:r>
     </w:p>
     <w:p>
@@ -3241,6 +3219,148 @@
     <w:p>
       <w:r>
         <w:br w:type="page"/>
+      </w:r>
+    </w:p>
+    <w:p>
+      <w:pPr>
+        <w:pStyle w:val="Heading2"/>
+      </w:pPr>
+      <w:r>
+        <w:t>6.4 אינטגרציה בין שפות תכנות (Python ↔ JavaScript)</w:t>
+      </w:r>
+    </w:p>
+    <w:p>
+      <w:pPr/>
+      <w:r>
+        <w:t>הפרויקט מממש אינטגרציה פונקציונלית מלאה בין שתי שפות תכנות שונות, כנדרש בפרויקט גמר בהנדסת תוכנה:</w:t>
+      </w:r>
+    </w:p>
+    <w:p>
+      <w:pPr>
+        <w:pStyle w:val="ListBullet"/>
+      </w:pPr>
+      <w:r>
+        <w:t>צד שרת (Backend) – Python 3.11+: מימוש הלוגיקה העסקית כולה – מנוע האופטימיזציה, מערכת האימות, ניהול בסיס הנתונים, הגבלת קצב, וחישובי מרחקים. השרת חושף REST API מלא באמצעות FastAPI, כאשר כל הנתונים מועברים בפורמט JSON.</w:t>
+      </w:r>
+    </w:p>
+    <w:p>
+      <w:pPr>
+        <w:pStyle w:val="ListBullet"/>
+      </w:pPr>
+      <w:r>
+        <w:t>צד לקוח (Frontend) – JavaScript (Vanilla): מימוש ממשק המשתמש כאפליקציית דף יחיד (SPA) – ניהול מצב, טיפול בבקשות HTTP (fetch API), עיבוד תגובות JSON, הצגת מפות (Leaflet.js), ואינטראקציה דינמית עם המשתמש. כל הלוגיקה בצד הלקוח כתובה ב-JavaScript טהור ללא frameworks.</w:t>
+      </w:r>
+    </w:p>
+    <w:p>
+      <w:pPr>
+        <w:pStyle w:val="ListBullet"/>
+      </w:pPr>
+      <w:r>
+        <w:t>תקשורת Client-Server: התקשורת בין שתי השפות מתבצעת באמצעות פרוטוקול HTTP עם בקשות REST (GET, POST, DELETE) והחלפת נתונים בפורמט JSON. האימות מבוסס על Bearer Token (JWT) המועבר בכותרת Authorization. ממשק הלקוח מבצע קריאות אסינכרוניות (async/await) לכל נקודות הקצה של השרת: אימות, אופטימיזציה, ניהול תרחישים, היסטוריה, ג'אוקודינג, וניתוב.</w:t>
+      </w:r>
+    </w:p>
+    <w:p>
+      <w:pPr/>
+      <w:r>
+        <w:t>שילוב זה מבטיח הפרדת אחריות ברורה (Separation of Concerns): Python אחראי על הלוגיקה, החישובים, והאבטחה; JavaScript אחראי על הצגת הנתונים והאינטראקציה עם המשתמש. הדבר מדגים ידע ושליטה בשתי סביבות פיתוח שונות ובתקשורת ביניהן – עיקרון מרכזי בפיתוח מערכות תוכנה מודרניות.</w:t>
+      </w:r>
+    </w:p>
+    <w:p>
+      <w:pPr>
+        <w:pStyle w:val="Heading2"/>
+      </w:pPr>
+      <w:r>
+        <w:t>6.5 ניתוח מערכת – תיאור דיאגרמות UML</w:t>
+      </w:r>
+    </w:p>
+    <w:p>
+      <w:pPr/>
+      <w:r>
+        <w:t>להלן תיאור מילולי של הדיאגרמות המרכזיות המאפיינות את המערכת. תיאורים אלה משקפים את המבנה והזרימה בפועל כפי שמומשו בגרסה הסופית של הפרויקט.</w:t>
+      </w:r>
+    </w:p>
+    <w:p>
+      <w:pPr>
+        <w:pStyle w:val="Heading3"/>
+      </w:pPr>
+      <w:r>
+        <w:t>6.5.1 תרשים מקרי שימוש (Use Case Diagram)</w:t>
+      </w:r>
+    </w:p>
+    <w:p>
+      <w:pPr/>
+      <w:r>
+        <w:t>המערכת מגדירה שחקן (Actor) יחיד – משתמש רשום. מקרי השימוש העיקריים הם: (1) רישום והתחברות למערכת; (2) הגדרת מחסן ועצירות (ידנית או באמצעות ג'אוקודינג); (3) הגדרת פרמטרי אופטימיזציה (אלגוריתם, משקלות, מגבלות); (4) הרצת אופטימיזציה וצפייה בתוצאות; (5) צפייה במסלול על מפה אינטראקטיבית; (6) שמירה, טעינה ומחיקה של תרחישים; (7) צפייה בהיסטוריית אופטימיזציות. כל מקרי השימוש למעט רישום/התחברות דורשים אימות מוקדם (precondition: authenticated).</w:t>
+      </w:r>
+    </w:p>
+    <w:p>
+      <w:pPr>
+        <w:pStyle w:val="Heading3"/>
+      </w:pPr>
+      <w:r>
+        <w:t>6.5.2 תרשים מחלקות (Class Diagram) – מודלי נתונים</w:t>
+      </w:r>
+    </w:p>
+    <w:p>
+      <w:pPr/>
+      <w:r>
+        <w:t>מודלי הנתונים מאורגנים בהיררכיה ברורה: המחלקה המרכזית היא RouteRequest המכילה אובייקט Depot (מחסן), רשימת Stop (עצירות), אובייקט Weights (משקלות), ואובייקט OptimizationConfig (תצורה). המחלקה Stop מכילה שדות מיקום (x, y, lat, lng), כתובת (city, street, house_number), ופרמטרי זמן (window_start, window_end, service_time, priority). המחלקה RouteResponse מכילה את תוצאות האופטימיזציה כולל מדדי עלות, ישימות, ורשימת VisitResult לכל עצירה. קשרים: RouteRequest ←composition→ Depot (1:1), RouteRequest ←composition→ Stop (1:N), ScenarioDetail ←contains→ RouteRequest, OptimizationHistoryDetail ←contains→ RouteRequest + RouteResponse.</w:t>
+      </w:r>
+    </w:p>
+    <w:p>
+      <w:pPr>
+        <w:pStyle w:val="Heading3"/>
+      </w:pPr>
+      <w:r>
+        <w:t>6.5.3 תרשים ארכיטקטורה (Architecture Diagram)</w:t>
+      </w:r>
+    </w:p>
+    <w:p>
+      <w:pPr/>
+      <w:r>
+        <w:t>הארכיטקטורה בנויה בשלוש שכבות: (1) שכבת הצגה – דפדפן המריץ SPA ב-JavaScript עם Leaflet.js, מתקשר דרך HTTP/REST; (2) שכבת שרת – FastAPI עם מודולים: Auth, Optimizer, Storage, RateLimiter, Utils; (3) שכבת נתונים – SQLite עם טבלאות users, saved_scenarios, optimization_runs. התקשורת בין השכבות: הלקוח שולח בקשות JSON לשרת ומקבל תגובות JSON. השרת ניגש לבסיס הנתונים באופן סינכרוני. כל הרכיבים ארוזים בקונטיינר Docker יחיד.</w:t>
+      </w:r>
+    </w:p>
+    <w:p>
+      <w:pPr>
+        <w:pStyle w:val="Heading3"/>
+      </w:pPr>
+      <w:r>
+        <w:t>6.5.4 תרשים זרימה – תהליך אופטימיזציה</w:t>
+      </w:r>
+    </w:p>
+    <w:p>
+      <w:pPr/>
+      <w:r>
+        <w:t>זרימת האופטימיזציה: (1) המשתמש ממלא מחסן, עצירות, ופרמטרים בממשק → (2) JavaScript שולח POST /optimize עם JSON → (3) השרת מאמת טוקן JWT → (4) בודק Rate Limit → (5) מבצע ולידציה על הקלט (Pydantic) → (6) בונה מטריצת מרחקים (Euclidean או TravelTime) → (7) מריץ בנייה חמדנית (Greedy) → (8) מריץ חיפוש מקומי (2-opt/Swap/Relocate) עד תנאי עצירה → (9) שומר בהיסטוריה (SQLite) → (10) מחזיר RouteResponse (JSON) → (11) JavaScript מציג תוצאות + מפה.</w:t>
+      </w:r>
+    </w:p>
+    <w:p>
+      <w:pPr>
+        <w:pStyle w:val="Heading3"/>
+      </w:pPr>
+      <w:r>
+        <w:t>6.5.5 תרשים זרימה – אימות (Authentication Flow)</w:t>
+      </w:r>
+    </w:p>
+    <w:p>
+      <w:pPr/>
+      <w:r>
+        <w:t>זרימת האימות: (1) משתמש מזין שם/דוא"ל וסיסמה בממשק → (2) JavaScript שולח POST /register או POST /login → (3) השרת מבצע ולידציה (regex, אורך, פורמט) → (4) ברישום: בודק כפילויות, מצפין סיסמה (scrypt), שומר ב-DB → (5) בהתחברות: מאתר משתמש, מאמת סיסמה (hmac.compare_digest) → (6) מנפיק JWT (HS256, 7 ימים) → (7) JavaScript שומר טוקן ב-localStorage → (8) כל בקשה עוקבת כוללת Authorization: Bearer &lt;token&gt; → (9) השרת מאמת חתימה ותוקף בכל בקשה מוגנת.</w:t>
+      </w:r>
+    </w:p>
+    <w:p>
+      <w:pPr>
+        <w:pStyle w:val="Heading3"/>
+      </w:pPr>
+      <w:r>
+        <w:t>6.5.6 תרשים זרימה – Geocode → Optimize → Map</w:t>
+      </w:r>
+    </w:p>
+    <w:p>
+      <w:pPr/>
+      <w:r>
+        <w:t>זרימת הג'אוקוד עד להצגת מפה: (1) המשתמש מקליד כתובת בשדה מחסן/עצירה → (2) JavaScript שולח GET /geocode/search?q=... → (3) השרת מחפש במאגר המיקומים הפנימי (התאמת שם חלקית) → (4) מחזיר רשימת תוצאות (lat, lon, display_name) → (5) המשתמש בוחר תוצאה, הקואורדינטות מתמלאות אוטומטית → (6) לאחר הרצת אופטימיזציה מוצלחת, JavaScript שולח POST /route-road עם waypoints → (7) השרת מחשב ניתוב פנימי (Haversine × מקדם כביש + נקודות עקומה) → (8) מחזיר geometry + מרחק + זמן → (9) JavaScript מצייר את המסלול על מפת Leaflet עם סמנים ממוספרים.</w:t>
       </w:r>
     </w:p>
     <w:p>
@@ -12706,14 +12826,77 @@
     </w:p>
     <w:p>
       <w:pPr>
+        <w:pStyle w:val="ListBullet"/>
+      </w:pPr>
+      <w:r>
+        <w:t>שילוב פונקציונלי בין Python ו-JavaScript – הפרויקט מדגים אינטגרציה מלאה בין שתי שפות תכנות באמצעות REST/JSON, עם הפרדת אחריות ברורה בין לוגיקה עסקית (Python) לבין ממשק משתמש (JavaScript), כנדרש בפרויקט גמר.</w:t>
+      </w:r>
+    </w:p>
+    <w:p>
+      <w:pPr>
         <w:pStyle w:val="Heading2"/>
         <w:bidi w:val="1"/>
       </w:pPr>
       <w:r>
-        <w:rPr>
-          <w:rtl/>
-        </w:rPr>
-        <w:t>13.4 מגבלות ידועות</w:t>
+        <w:t>13.4 מגבלות ידועות והחלטות עיצוב</w:t>
+      </w:r>
+    </w:p>
+    <w:p>
+      <w:pPr/>
+      <w:r>
+        <w:t>להלן סקירה של המגבלות הידועות במערכת הנוכחית. מגבלות אלה נובעות מהחלטות עיצוב מודעות, מתוך שיקולי היקף הפרויקט, עצמאות משירותים חיצוניים, ומורכבות יישום:</w:t>
+      </w:r>
+    </w:p>
+    <w:p>
+      <w:pPr>
+        <w:pStyle w:val="ListBullet"/>
+      </w:pPr>
+      <w:r>
+        <w:t>רכב יחיד: המערכת הנוכחית מטפלת במסלול של רכב בודד (Single-Vehicle VRPTW). זוהי החלטה מודעת שנועדה לאפשר מיקוד באיכות האלגוריתמים ובמורכבות פונקציית העלות, ללא הוספת שכבת חלוקה לצי רכבים. הרחבה ל-Multi-Vehicle VRP מתוכננת כשלב עתידי.</w:t>
+      </w:r>
+    </w:p>
+    <w:p>
+      <w:pPr>
+        <w:pStyle w:val="ListBullet"/>
+      </w:pPr>
+      <w:r>
+        <w:t>ג'אוקודר פנימי מוגבל: מערכת הג'אוקודינג מבוססת על מאגר מיקומים מובנה ולא על שירות חיצוני. ההחלטה נבעה מהרצון לשמור על עצמאות מלאה ולמנוע תלות בשירותי צד שלישי (API keys, rate limits). המאגר הנוכחי מכיל מיקומים נבחרים בלונדון, ניו-יורק ופריז. בסביבת ייצור, ניתן לחבר שירות ג'אוקודינג חיצוני (Nominatim, Google Geocoding) ללא שינוי בארכיטקטורה.</w:t>
+      </w:r>
+    </w:p>
+    <w:p>
+      <w:pPr>
+        <w:pStyle w:val="ListBullet"/>
+      </w:pPr>
+      <w:r>
+        <w:t>ניתוב כביש משוער: ניתוב הכביש הפנימי מבוסס על מרחק Haversine (Great-circle) מוכפל במקדם כביש (1.28 לנהיגה, 1.12 להליכה) – אומדן סטטיסטי ולא ניתוב ברשת כבישים אמיתית. הגיאומטריה המוצגת על המפה היא עקומה חזותית (Bezier) ולא מסלול כביש מדויק. גישה זו מספקת קירוב סביר ומאפשרת פעולה ללא שירות ניתוב חיצוני. בשלב עתידי ניתן לשלב OSRM או Mapbox Directions לניתוב מדויק.</w:t>
+      </w:r>
+    </w:p>
+    <w:p>
+      <w:pPr>
+        <w:pStyle w:val="ListBullet"/>
+      </w:pPr>
+      <w:r>
+        <w:t>חיפוש מקומי (לא גלובלי): האלגוריתמים המיושמים (2-opt, Swap, Relocate) הם אלגוריתמי חיפוש מקומי שאינם מבטיחים הגעה לאופטימום גלובלי. עם זאת, בפרקטיקה הם מספקים פתרונות איכותיים בזמן סביר, במיוחד בשילוב עם בנייה חמדנית ראשונית. זהו trade-off מודע בין איכות הפתרון לבין זמן חישוב ופשטות יישום.</w:t>
+      </w:r>
+    </w:p>
+    <w:p>
+      <w:pPr>
+        <w:pStyle w:val="ListBullet"/>
+      </w:pPr>
+      <w:r>
+        <w:t>SQLite לאחסון: בסיס הנתונים SQLite מתאים לשימוש של משתמש יחיד או צוות קטן. במקרה של עומסים גבוהים עם גישה מקבילית אינטנסיבית, מומלץ לעבור לבסיס נתונים כמו PostgreSQL. עם זאת, עבור היקף הפרויקט הנוכחי, SQLite מספק ביצועים מצוינים ופשטות פריסה.</w:t>
+      </w:r>
+    </w:p>
+    <w:p>
+      <w:pPr>
+        <w:pStyle w:val="Heading2"/>
+        <w:bidi w:val="1"/>
+      </w:pPr>
+      <w:r>
+        <w:rPr>
+          <w:rtl/>
+        </w:rPr>
+        <w:t>13.5 כיווני פיתוח עתידיים</w:t>
       </w:r>
     </w:p>
     <w:p>
@@ -12727,14 +12910,14 @@
           <w:sz w:val="22"/>
           <w:rtl/>
         </w:rPr>
-        <w:t>רכב יחיד</w:t>
+        <w:t>תמיכה בצי רכבים</w:t>
       </w:r>
       <w:r>
         <w:rPr>
           <w:sz w:val="22"/>
           <w:rtl/>
         </w:rPr>
-        <w:t xml:space="preserve"> – המערכת מטפלת במסלול של רכב בודד; אינה תומכת בפיצול לצי רכבים</w:t>
+        <w:t xml:space="preserve"> – הרחבה ל-Multi-Vehicle VRP</w:t>
       </w:r>
     </w:p>
     <w:p>
@@ -12748,14 +12931,14 @@
           <w:sz w:val="22"/>
           <w:rtl/>
         </w:rPr>
-        <w:t>ג'אוקודר מוגבל</w:t>
+        <w:t>אלגוריתמים מתקדמים</w:t>
       </w:r>
       <w:r>
         <w:rPr>
           <w:sz w:val="22"/>
           <w:rtl/>
         </w:rPr>
-        <w:t xml:space="preserve"> – הג'אוקודר הפנימי מכיל מספר מצומצם של מיקומים מוכרים; בייצור מומלץ לחבר שירות חיצוני</w:t>
+        <w:t xml:space="preserve"> – הוספת Simulated Annealing, Genetic Algorithm, או Ant Colony Optimization</w:t>
       </w:r>
     </w:p>
     <w:p>
@@ -12769,14 +12952,14 @@
           <w:sz w:val="22"/>
           <w:rtl/>
         </w:rPr>
-        <w:t>ניתוב משוער</w:t>
+        <w:t>אופטימיזציה בזמן אמת</w:t>
       </w:r>
       <w:r>
         <w:rPr>
           <w:sz w:val="22"/>
           <w:rtl/>
         </w:rPr>
-        <w:t xml:space="preserve"> – ניתוב הכביש הפנימי הוא אומדן (מרחק × מקדם) ולא מבוסס רשת כבישים אמיתית</w:t>
+        <w:t xml:space="preserve"> – עדכון מסלול דינמי בהתאם לתנועה ושינויים</w:t>
       </w:r>
     </w:p>
     <w:p>
@@ -12790,14 +12973,14 @@
           <w:sz w:val="22"/>
           <w:rtl/>
         </w:rPr>
-        <w:t>אין אופטימיזציה גלובלית</w:t>
+        <w:t>אינטגרציה עם שירותי מפות</w:t>
       </w:r>
       <w:r>
         <w:rPr>
           <w:sz w:val="22"/>
           <w:rtl/>
         </w:rPr>
-        <w:t xml:space="preserve"> – האלגוריתמים הם חיפוש מקומי ואינם מבטיחים אופטימום גלובלי</w:t>
+        <w:t xml:space="preserve"> – Google Maps API, Mapbox, OSRM לניתוב מדויק</w:t>
       </w:r>
     </w:p>
     <w:p>
@@ -12811,26 +12994,14 @@
           <w:sz w:val="22"/>
           <w:rtl/>
         </w:rPr>
-        <w:t>SQLite</w:t>
+        <w:t>אפליקציית מובייל</w:t>
       </w:r>
       <w:r>
         <w:rPr>
           <w:sz w:val="22"/>
           <w:rtl/>
         </w:rPr>
-        <w:t xml:space="preserve"> – מתאים לשימוש יחיד/קטן; לעומסים גבוהים מומלץ לעבור ל-PostgreSQL</w:t>
-      </w:r>
-    </w:p>
-    <w:p>
-      <w:pPr>
-        <w:pStyle w:val="Heading2"/>
-        <w:bidi w:val="1"/>
-      </w:pPr>
-      <w:r>
-        <w:rPr>
-          <w:rtl/>
-        </w:rPr>
-        <w:t>13.5 כיווני פיתוח עתידיים</w:t>
+        <w:t xml:space="preserve"> – נהג עם ניווט בזמן אמת</w:t>
       </w:r>
     </w:p>
     <w:p>
@@ -12844,14 +13015,14 @@
           <w:sz w:val="22"/>
           <w:rtl/>
         </w:rPr>
-        <w:t>תמיכה בצי רכבים</w:t>
+        <w:t>דוחות וניתוח</w:t>
       </w:r>
       <w:r>
         <w:rPr>
           <w:sz w:val="22"/>
           <w:rtl/>
         </w:rPr>
-        <w:t xml:space="preserve"> – הרחבה ל-Multi-Vehicle VRP</w:t>
+        <w:t xml:space="preserve"> – דשבורד עם סטטיסטיקות היסטוריות ומגמות</w:t>
       </w:r>
     </w:p>
     <w:p>
@@ -12865,14 +13036,14 @@
           <w:sz w:val="22"/>
           <w:rtl/>
         </w:rPr>
-        <w:t>אלגוריתמים מתקדמים</w:t>
+        <w:t>ייצוא</w:t>
       </w:r>
       <w:r>
         <w:rPr>
           <w:sz w:val="22"/>
           <w:rtl/>
         </w:rPr>
-        <w:t xml:space="preserve"> – הוספת Simulated Annealing, Genetic Algorithm, או Ant Colony Optimization</w:t>
+        <w:t xml:space="preserve"> – ייצוא מסלולים לפורמטים שונים (GPX, CSV, PDF)</w:t>
       </w:r>
     </w:p>
     <w:p>
@@ -12886,118 +13057,13 @@
           <w:sz w:val="22"/>
           <w:rtl/>
         </w:rPr>
-        <w:t>אופטימיזציה בזמן אמת</w:t>
+        <w:t>מערכת הרשאות</w:t>
       </w:r>
       <w:r>
         <w:rPr>
           <w:sz w:val="22"/>
           <w:rtl/>
         </w:rPr>
-        <w:t xml:space="preserve"> – עדכון מסלול דינמי בהתאם לתנועה ושינויים</w:t>
-      </w:r>
-    </w:p>
-    <w:p>
-      <w:pPr>
-        <w:pStyle w:val="ListNumber"/>
-        <w:bidi w:val="1"/>
-      </w:pPr>
-      <w:r>
-        <w:rPr>
-          <w:b/>
-          <w:sz w:val="22"/>
-          <w:rtl/>
-        </w:rPr>
-        <w:t>אינטגרציה עם שירותי מפות</w:t>
-      </w:r>
-      <w:r>
-        <w:rPr>
-          <w:sz w:val="22"/>
-          <w:rtl/>
-        </w:rPr>
-        <w:t xml:space="preserve"> – Google Maps API, Mapbox, OSRM לניתוב מדויק</w:t>
-      </w:r>
-    </w:p>
-    <w:p>
-      <w:pPr>
-        <w:pStyle w:val="ListNumber"/>
-        <w:bidi w:val="1"/>
-      </w:pPr>
-      <w:r>
-        <w:rPr>
-          <w:b/>
-          <w:sz w:val="22"/>
-          <w:rtl/>
-        </w:rPr>
-        <w:t>אפליקציית מובייל</w:t>
-      </w:r>
-      <w:r>
-        <w:rPr>
-          <w:sz w:val="22"/>
-          <w:rtl/>
-        </w:rPr>
-        <w:t xml:space="preserve"> – נהג עם ניווט בזמן אמת</w:t>
-      </w:r>
-    </w:p>
-    <w:p>
-      <w:pPr>
-        <w:pStyle w:val="ListNumber"/>
-        <w:bidi w:val="1"/>
-      </w:pPr>
-      <w:r>
-        <w:rPr>
-          <w:b/>
-          <w:sz w:val="22"/>
-          <w:rtl/>
-        </w:rPr>
-        <w:t>דוחות וניתוח</w:t>
-      </w:r>
-      <w:r>
-        <w:rPr>
-          <w:sz w:val="22"/>
-          <w:rtl/>
-        </w:rPr>
-        <w:t xml:space="preserve"> – דשבורד עם סטטיסטיקות היסטוריות ומגמות</w:t>
-      </w:r>
-    </w:p>
-    <w:p>
-      <w:pPr>
-        <w:pStyle w:val="ListNumber"/>
-        <w:bidi w:val="1"/>
-      </w:pPr>
-      <w:r>
-        <w:rPr>
-          <w:b/>
-          <w:sz w:val="22"/>
-          <w:rtl/>
-        </w:rPr>
-        <w:t>ייצוא</w:t>
-      </w:r>
-      <w:r>
-        <w:rPr>
-          <w:sz w:val="22"/>
-          <w:rtl/>
-        </w:rPr>
-        <w:t xml:space="preserve"> – ייצוא מסלולים לפורמטים שונים (GPX, CSV, PDF)</w:t>
-      </w:r>
-    </w:p>
-    <w:p>
-      <w:pPr>
-        <w:pStyle w:val="ListNumber"/>
-        <w:bidi w:val="1"/>
-      </w:pPr>
-      <w:r>
-        <w:rPr>
-          <w:b/>
-          <w:sz w:val="22"/>
-          <w:rtl/>
-        </w:rPr>
-        <w:t>מערכת הרשאות</w:t>
-      </w:r>
-      <w:r>
-        <w:rPr>
-          <w:sz w:val="22"/>
-          <w:rtl/>
-        </w:rPr>
         <w:t xml:space="preserve"> – תפקידים (admin, dispatcher, driver) עם הרשאות שונות</w:t>
       </w:r>
     </w:p>
@@ -13009,13 +13075,120 @@
     <w:p>
       <w:pPr>
         <w:pStyle w:val="Heading1"/>
-        <w:bidi w:val="1"/>
-      </w:pPr>
-      <w:r>
-        <w:rPr>
-          <w:rtl/>
-        </w:rPr>
-        <w:t>14. נספחים</w:t>
+      </w:pPr>
+      <w:r>
+        <w:t>15. מקורות וביבליוגרפיה</w:t>
+      </w:r>
+    </w:p>
+    <w:p>
+      <w:pPr/>
+      <w:r>
+        <w:t>להלן רשימת המקורות, הטכנולוגיות, והמסגרות התיאורטיות עליהן מבוסס הפרויקט:</w:t>
+      </w:r>
+    </w:p>
+    <w:p>
+      <w:pPr>
+        <w:pStyle w:val="ListBullet"/>
+      </w:pPr>
+      <w:r>
+        <w:t>[1] Toth, P. &amp; Vigo, D. (2014). Vehicle Routing: Problems, Methods, and Applications. SIAM, Second Edition. – ספר הייחוס המרכזי לבעיות VRP ושיטות פתרון.</w:t>
+      </w:r>
+    </w:p>
+    <w:p>
+      <w:pPr>
+        <w:pStyle w:val="ListBullet"/>
+      </w:pPr>
+      <w:r>
+        <w:t>[2] Solomon, M. M. (1987). "Algorithms for the Vehicle Routing and Scheduling Problems with Time Window Constraints." Operations Research, 35(2), 254–265. – מאמר מייסד על VRPTW ואלגוריתמים חמדניים.</w:t>
+      </w:r>
+    </w:p>
+    <w:p>
+      <w:pPr>
+        <w:pStyle w:val="ListBullet"/>
+      </w:pPr>
+      <w:r>
+        <w:t>[3] Or, I. (1976). Traveling Salesman-Type Combinational Problems and their Relation to the Logistics of Regional Blood Banking. PhD Thesis, Northwestern University. – מקור ל-Or-opt ושיפורי מסלול.</w:t>
+      </w:r>
+    </w:p>
+    <w:p>
+      <w:pPr>
+        <w:pStyle w:val="ListBullet"/>
+      </w:pPr>
+      <w:r>
+        <w:t>[4] Lin, S. (1965). "Computer Solutions of the Traveling Salesman Problem." Bell System Technical Journal, 44(10), 2245–2269. – אלגוריתם 2-opt המקורי.</w:t>
+      </w:r>
+    </w:p>
+    <w:p>
+      <w:pPr>
+        <w:pStyle w:val="ListBullet"/>
+      </w:pPr>
+      <w:r>
+        <w:t>[5] FastAPI Documentation. https://fastapi.tiangolo.com/ – מסגרת Python מודרנית לבניית APIs עם ולידציה אוטומטית ותיעוד OpenAPI.</w:t>
+      </w:r>
+    </w:p>
+    <w:p>
+      <w:pPr>
+        <w:pStyle w:val="ListBullet"/>
+      </w:pPr>
+      <w:r>
+        <w:t>[6] Pydantic Documentation, v2. https://docs.pydantic.dev/ – ספריית ולידציה וסריאליזציה המשמשת לכל מודלי הנתונים במערכת.</w:t>
+      </w:r>
+    </w:p>
+    <w:p>
+      <w:pPr>
+        <w:pStyle w:val="ListBullet"/>
+      </w:pPr>
+      <w:r>
+        <w:t>[7] Leaflet.js Documentation. https://leafletjs.com/ – ספריית JavaScript למפות אינטראקטיביות, בשימוש להצגת מסלולים.</w:t>
+      </w:r>
+    </w:p>
+    <w:p>
+      <w:pPr>
+        <w:pStyle w:val="ListBullet"/>
+      </w:pPr>
+      <w:r>
+        <w:t>[8] RFC 7519 – JSON Web Token (JWT). https://tools.ietf.org/html/rfc7519 – תקן JWT המשמש לאימות משתמשים במערכת.</w:t>
+      </w:r>
+    </w:p>
+    <w:p>
+      <w:pPr>
+        <w:pStyle w:val="ListBullet"/>
+      </w:pPr>
+      <w:r>
+        <w:t>[9] Percival, C. (2009). "Stronger Key Derivation via Sequential Memory-Hard Functions." BSDCan 2009. – תיאור אלגוריתם scrypt להצפנת סיסמאות.</w:t>
+      </w:r>
+    </w:p>
+    <w:p>
+      <w:pPr>
+        <w:pStyle w:val="ListBullet"/>
+      </w:pPr>
+      <w:r>
+        <w:t>[10] Docker Documentation. https://docs.docker.com/ – פלטפורמת קונטיינרים המשמשת לפריסת המערכת.</w:t>
+      </w:r>
+    </w:p>
+    <w:p>
+      <w:pPr>
+        <w:pStyle w:val="ListBullet"/>
+      </w:pPr>
+      <w:r>
+        <w:t>[11] SQLite Documentation. https://www.sqlite.org/docs.html – מנוע בסיס נתונים מוטמע המשמש לאחסון נתוני המערכת.</w:t>
+      </w:r>
+    </w:p>
+    <w:p>
+      <w:pPr>
+        <w:pStyle w:val="ListBullet"/>
+      </w:pPr>
+      <w:r>
+        <w:t>[12] Sinnott, R.W. (1984). "Virtues of the Haversine." Sky and Telescope, 68(2), 159. – נוסחת Haversine לחישוב מרחקים גיאוגרפיים.</w:t>
+      </w:r>
+    </w:p>
+    <w:p>
+      <w:pPr>
+        <w:pStyle w:val="Heading1"/>
+        <w:bidi w:val="1"/>
+      </w:pPr>
+      <w:r>
+        <w:t>16. נספחים</w:t>
       </w:r>
     </w:p>
     <w:p>

</xml_diff>